<commit_message>
update presentation and remove personal information
</commit_message>
<xml_diff>
--- a/07_研究记录/MCPTox疑点.docx
+++ b/07_研究记录/MCPTox疑点.docx
@@ -138,6 +138,19 @@
       </w:r>
     </w:p>
     <w:p>
+      <w:pPr>
+        <w:rPr>
+          <w:rFonts w:hint="eastAsia" w:ascii="微软雅黑" w:hAnsi="微软雅黑" w:eastAsia="微软雅黑" w:cs="微软雅黑"/>
+          <w:i w:val="0"/>
+          <w:iCs w:val="0"/>
+          <w:caps w:val="0"/>
+          <w:color w:val="000000"/>
+          <w:spacing w:val="0"/>
+          <w:sz w:val="19"/>
+          <w:szCs w:val="19"/>
+          <w:shd w:val="clear" w:fill="FFFFFF"/>
+        </w:rPr>
+      </w:pPr>
       <w:r>
         <w:rPr>
           <w:rStyle w:val="4"/>
@@ -169,6 +182,342 @@
           <w:shd w:val="clear" w:fill="FFFFFF"/>
         </w:rPr>
         <w:t>，因为它们的指令遵循能力更强。论文将这种现象称为"Inverse Scaling"</w:t>
+      </w:r>
+    </w:p>
+    <w:p>
+      <w:r>
+        <w:drawing>
+          <wp:inline distT="0" distB="0" distL="114300" distR="114300">
+            <wp:extent cx="5271770" cy="3775710"/>
+            <wp:effectExtent l="0" t="0" r="1270" b="3810"/>
+            <wp:docPr id="4" name="图片 1"/>
+            <wp:cNvGraphicFramePr>
+              <a:graphicFrameLocks xmlns:a="http://schemas.openxmlformats.org/drawingml/2006/main" noChangeAspect="1"/>
+            </wp:cNvGraphicFramePr>
+            <a:graphic xmlns:a="http://schemas.openxmlformats.org/drawingml/2006/main">
+              <a:graphicData uri="http://schemas.openxmlformats.org/drawingml/2006/picture">
+                <pic:pic xmlns:pic="http://schemas.openxmlformats.org/drawingml/2006/picture">
+                  <pic:nvPicPr>
+                    <pic:cNvPr id="4" name="图片 1"/>
+                    <pic:cNvPicPr>
+                      <a:picLocks noChangeAspect="1"/>
+                    </pic:cNvPicPr>
+                  </pic:nvPicPr>
+                  <pic:blipFill>
+                    <a:blip r:embed="rId7"/>
+                    <a:stretch>
+                      <a:fillRect/>
+                    </a:stretch>
+                  </pic:blipFill>
+                  <pic:spPr>
+                    <a:xfrm>
+                      <a:off x="0" y="0"/>
+                      <a:ext cx="5271770" cy="3775710"/>
+                    </a:xfrm>
+                    <a:prstGeom prst="rect">
+                      <a:avLst/>
+                    </a:prstGeom>
+                    <a:noFill/>
+                    <a:ln>
+                      <a:noFill/>
+                    </a:ln>
+                  </pic:spPr>
+                </pic:pic>
+              </a:graphicData>
+            </a:graphic>
+          </wp:inline>
+        </w:drawing>
+      </w:r>
+    </w:p>
+    <w:p>
+      <w:pPr>
+        <w:jc w:val="center"/>
+      </w:pPr>
+      <w:r>
+        <w:drawing>
+          <wp:inline distT="0" distB="0" distL="114300" distR="114300">
+            <wp:extent cx="4526280" cy="1591310"/>
+            <wp:effectExtent l="0" t="0" r="0" b="8890"/>
+            <wp:docPr id="5" name="图片 2"/>
+            <wp:cNvGraphicFramePr>
+              <a:graphicFrameLocks xmlns:a="http://schemas.openxmlformats.org/drawingml/2006/main" noChangeAspect="1"/>
+            </wp:cNvGraphicFramePr>
+            <a:graphic xmlns:a="http://schemas.openxmlformats.org/drawingml/2006/main">
+              <a:graphicData uri="http://schemas.openxmlformats.org/drawingml/2006/picture">
+                <pic:pic xmlns:pic="http://schemas.openxmlformats.org/drawingml/2006/picture">
+                  <pic:nvPicPr>
+                    <pic:cNvPr id="5" name="图片 2"/>
+                    <pic:cNvPicPr>
+                      <a:picLocks noChangeAspect="1"/>
+                    </pic:cNvPicPr>
+                  </pic:nvPicPr>
+                  <pic:blipFill>
+                    <a:blip r:embed="rId8"/>
+                    <a:stretch>
+                      <a:fillRect/>
+                    </a:stretch>
+                  </pic:blipFill>
+                  <pic:spPr>
+                    <a:xfrm>
+                      <a:off x="0" y="0"/>
+                      <a:ext cx="4526280" cy="1591310"/>
+                    </a:xfrm>
+                    <a:prstGeom prst="rect">
+                      <a:avLst/>
+                    </a:prstGeom>
+                    <a:noFill/>
+                    <a:ln>
+                      <a:noFill/>
+                    </a:ln>
+                  </pic:spPr>
+                </pic:pic>
+              </a:graphicData>
+            </a:graphic>
+          </wp:inline>
+        </w:drawing>
+      </w:r>
+    </w:p>
+    <w:p>
+      <w:pPr>
+        <w:jc w:val="both"/>
+      </w:pPr>
+      <w:r>
+        <w:drawing>
+          <wp:inline distT="0" distB="0" distL="114300" distR="114300">
+            <wp:extent cx="5269865" cy="2931160"/>
+            <wp:effectExtent l="0" t="0" r="3175" b="10160"/>
+            <wp:docPr id="6" name="图片 3"/>
+            <wp:cNvGraphicFramePr>
+              <a:graphicFrameLocks xmlns:a="http://schemas.openxmlformats.org/drawingml/2006/main" noChangeAspect="1"/>
+            </wp:cNvGraphicFramePr>
+            <a:graphic xmlns:a="http://schemas.openxmlformats.org/drawingml/2006/main">
+              <a:graphicData uri="http://schemas.openxmlformats.org/drawingml/2006/picture">
+                <pic:pic xmlns:pic="http://schemas.openxmlformats.org/drawingml/2006/picture">
+                  <pic:nvPicPr>
+                    <pic:cNvPr id="6" name="图片 3"/>
+                    <pic:cNvPicPr>
+                      <a:picLocks noChangeAspect="1"/>
+                    </pic:cNvPicPr>
+                  </pic:nvPicPr>
+                  <pic:blipFill>
+                    <a:blip r:embed="rId9"/>
+                    <a:stretch>
+                      <a:fillRect/>
+                    </a:stretch>
+                  </pic:blipFill>
+                  <pic:spPr>
+                    <a:xfrm>
+                      <a:off x="0" y="0"/>
+                      <a:ext cx="5269865" cy="2931160"/>
+                    </a:xfrm>
+                    <a:prstGeom prst="rect">
+                      <a:avLst/>
+                    </a:prstGeom>
+                    <a:noFill/>
+                    <a:ln>
+                      <a:noFill/>
+                    </a:ln>
+                  </pic:spPr>
+                </pic:pic>
+              </a:graphicData>
+            </a:graphic>
+          </wp:inline>
+        </w:drawing>
+      </w:r>
+    </w:p>
+    <w:p>
+      <w:pPr>
+        <w:jc w:val="both"/>
+      </w:pPr>
+      <w:r>
+        <w:drawing>
+          <wp:inline distT="0" distB="0" distL="114300" distR="114300">
+            <wp:extent cx="5274310" cy="2131695"/>
+            <wp:effectExtent l="0" t="0" r="13970" b="1905"/>
+            <wp:docPr id="7" name="图片 4"/>
+            <wp:cNvGraphicFramePr>
+              <a:graphicFrameLocks xmlns:a="http://schemas.openxmlformats.org/drawingml/2006/main" noChangeAspect="1"/>
+            </wp:cNvGraphicFramePr>
+            <a:graphic xmlns:a="http://schemas.openxmlformats.org/drawingml/2006/main">
+              <a:graphicData uri="http://schemas.openxmlformats.org/drawingml/2006/picture">
+                <pic:pic xmlns:pic="http://schemas.openxmlformats.org/drawingml/2006/picture">
+                  <pic:nvPicPr>
+                    <pic:cNvPr id="7" name="图片 4"/>
+                    <pic:cNvPicPr>
+                      <a:picLocks noChangeAspect="1"/>
+                    </pic:cNvPicPr>
+                  </pic:nvPicPr>
+                  <pic:blipFill>
+                    <a:blip r:embed="rId10"/>
+                    <a:stretch>
+                      <a:fillRect/>
+                    </a:stretch>
+                  </pic:blipFill>
+                  <pic:spPr>
+                    <a:xfrm>
+                      <a:off x="0" y="0"/>
+                      <a:ext cx="5274310" cy="2131695"/>
+                    </a:xfrm>
+                    <a:prstGeom prst="rect">
+                      <a:avLst/>
+                    </a:prstGeom>
+                    <a:noFill/>
+                    <a:ln>
+                      <a:noFill/>
+                    </a:ln>
+                  </pic:spPr>
+                </pic:pic>
+              </a:graphicData>
+            </a:graphic>
+          </wp:inline>
+        </w:drawing>
+      </w:r>
+    </w:p>
+    <w:p>
+      <w:pPr>
+        <w:jc w:val="both"/>
+      </w:pPr>
+      <w:r>
+        <w:drawing>
+          <wp:inline distT="0" distB="0" distL="114300" distR="114300">
+            <wp:extent cx="5274310" cy="2976245"/>
+            <wp:effectExtent l="0" t="0" r="13970" b="10795"/>
+            <wp:docPr id="8" name="图片 5"/>
+            <wp:cNvGraphicFramePr>
+              <a:graphicFrameLocks xmlns:a="http://schemas.openxmlformats.org/drawingml/2006/main" noChangeAspect="1"/>
+            </wp:cNvGraphicFramePr>
+            <a:graphic xmlns:a="http://schemas.openxmlformats.org/drawingml/2006/main">
+              <a:graphicData uri="http://schemas.openxmlformats.org/drawingml/2006/picture">
+                <pic:pic xmlns:pic="http://schemas.openxmlformats.org/drawingml/2006/picture">
+                  <pic:nvPicPr>
+                    <pic:cNvPr id="8" name="图片 5"/>
+                    <pic:cNvPicPr>
+                      <a:picLocks noChangeAspect="1"/>
+                    </pic:cNvPicPr>
+                  </pic:nvPicPr>
+                  <pic:blipFill>
+                    <a:blip r:embed="rId11"/>
+                    <a:stretch>
+                      <a:fillRect/>
+                    </a:stretch>
+                  </pic:blipFill>
+                  <pic:spPr>
+                    <a:xfrm>
+                      <a:off x="0" y="0"/>
+                      <a:ext cx="5274310" cy="2976245"/>
+                    </a:xfrm>
+                    <a:prstGeom prst="rect">
+                      <a:avLst/>
+                    </a:prstGeom>
+                    <a:noFill/>
+                    <a:ln>
+                      <a:noFill/>
+                    </a:ln>
+                  </pic:spPr>
+                </pic:pic>
+              </a:graphicData>
+            </a:graphic>
+          </wp:inline>
+        </w:drawing>
+      </w:r>
+    </w:p>
+    <w:p>
+      <w:pPr>
+        <w:jc w:val="both"/>
+      </w:pPr>
+      <w:r>
+        <w:drawing>
+          <wp:inline distT="0" distB="0" distL="114300" distR="114300">
+            <wp:extent cx="5269865" cy="3319780"/>
+            <wp:effectExtent l="0" t="0" r="3175" b="2540"/>
+            <wp:docPr id="9" name="图片 6"/>
+            <wp:cNvGraphicFramePr>
+              <a:graphicFrameLocks xmlns:a="http://schemas.openxmlformats.org/drawingml/2006/main" noChangeAspect="1"/>
+            </wp:cNvGraphicFramePr>
+            <a:graphic xmlns:a="http://schemas.openxmlformats.org/drawingml/2006/main">
+              <a:graphicData uri="http://schemas.openxmlformats.org/drawingml/2006/picture">
+                <pic:pic xmlns:pic="http://schemas.openxmlformats.org/drawingml/2006/picture">
+                  <pic:nvPicPr>
+                    <pic:cNvPr id="9" name="图片 6"/>
+                    <pic:cNvPicPr>
+                      <a:picLocks noChangeAspect="1"/>
+                    </pic:cNvPicPr>
+                  </pic:nvPicPr>
+                  <pic:blipFill>
+                    <a:blip r:embed="rId12"/>
+                    <a:stretch>
+                      <a:fillRect/>
+                    </a:stretch>
+                  </pic:blipFill>
+                  <pic:spPr>
+                    <a:xfrm>
+                      <a:off x="0" y="0"/>
+                      <a:ext cx="5269865" cy="3319780"/>
+                    </a:xfrm>
+                    <a:prstGeom prst="rect">
+                      <a:avLst/>
+                    </a:prstGeom>
+                    <a:noFill/>
+                    <a:ln>
+                      <a:noFill/>
+                    </a:ln>
+                  </pic:spPr>
+                </pic:pic>
+              </a:graphicData>
+            </a:graphic>
+          </wp:inline>
+        </w:drawing>
+      </w:r>
+    </w:p>
+    <w:p>
+      <w:pPr>
+        <w:jc w:val="both"/>
+        <w:rPr>
+          <w:rFonts w:hint="eastAsia"/>
+        </w:rPr>
+      </w:pPr>
+      <w:r>
+        <w:drawing>
+          <wp:inline distT="0" distB="0" distL="114300" distR="114300">
+            <wp:extent cx="5271135" cy="1288415"/>
+            <wp:effectExtent l="0" t="0" r="1905" b="6985"/>
+            <wp:docPr id="10" name="图片 7"/>
+            <wp:cNvGraphicFramePr>
+              <a:graphicFrameLocks xmlns:a="http://schemas.openxmlformats.org/drawingml/2006/main" noChangeAspect="1"/>
+            </wp:cNvGraphicFramePr>
+            <a:graphic xmlns:a="http://schemas.openxmlformats.org/drawingml/2006/main">
+              <a:graphicData uri="http://schemas.openxmlformats.org/drawingml/2006/picture">
+                <pic:pic xmlns:pic="http://schemas.openxmlformats.org/drawingml/2006/picture">
+                  <pic:nvPicPr>
+                    <pic:cNvPr id="10" name="图片 7"/>
+                    <pic:cNvPicPr>
+                      <a:picLocks noChangeAspect="1"/>
+                    </pic:cNvPicPr>
+                  </pic:nvPicPr>
+                  <pic:blipFill>
+                    <a:blip r:embed="rId13"/>
+                    <a:stretch>
+                      <a:fillRect/>
+                    </a:stretch>
+                  </pic:blipFill>
+                  <pic:spPr>
+                    <a:xfrm>
+                      <a:off x="0" y="0"/>
+                      <a:ext cx="5271135" cy="1288415"/>
+                    </a:xfrm>
+                    <a:prstGeom prst="rect">
+                      <a:avLst/>
+                    </a:prstGeom>
+                    <a:noFill/>
+                    <a:ln>
+                      <a:noFill/>
+                    </a:ln>
+                  </pic:spPr>
+                </pic:pic>
+              </a:graphicData>
+            </a:graphic>
+          </wp:inline>
+        </w:drawing>
       </w:r>
       <w:bookmarkStart w:id="0" w:name="_GoBack"/>
       <w:bookmarkEnd w:id="0"/>

</xml_diff>